<commit_message>
Close the last two white-paper review items
Review item (v): the paper said Massachusetts was 'late in 13 of 13 fiscal years'
and that lateness ranged 3-163 days. Those are two different events — 12 were late
enactments in that range, and FY2027 had no enacted budget at all as of August
2026. Stated separately now.

Review item (i): the cover read FY2014-FY2027 while every analysis figure runs
FY2015-FY2027, which is the inconsistency review flagged. The cause is a single
FY2014 record for New Jersey that is excluded from every statistic; the cover and
methodology now say so instead of leaving two spans unreconciled.

Co-Authored-By: Claude Opus 5 <noreply@anthropic.com>
</commit_message>
<xml_diff>
--- a/paper/Roboro_Whitepaper_Budget_Timing_v2.docx
+++ b/paper/Roboro_Whitepaper_Budget_Timing_v2.docx
@@ -111,7 +111,7 @@
           <w:sz w:val="21"/>
           <w:szCs w:val="21"/>
         </w:rPr>
-        <w:t xml:space="preserve">Based on 651 verified state-fiscal-years, FY2014–FY2027.</w:t>
+        <w:t xml:space="preserve">Based on 651 verified state-fiscal-years. Analysis runs FY2015–FY2027; one earlier record (New Jersey FY2014) sits in the dataset and is excluded from every statistic.</w:t>
       </w:r>
     </w:p>
     <w:p>
@@ -689,7 +689,7 @@
           <w:sz w:val="22"/>
           <w:szCs w:val="22"/>
         </w:rPr>
-        <w:t xml:space="preserve">Massachusetts — 13 of 13 fiscal years late, the only state that has never made its deadline. Lateness ranges from 3 to 163 days. Interim budgets are routine rather than emergency measures. The FY2021 budget was not signed until 11 December 2020, 163 days into the fiscal year.</w:t>
+        <w:t xml:space="preserve">Massachusetts — the only state that has never made its deadline, missing in all 13 tracked years. Twelve were late enactments ranging from 3 to 163 days past the fiscal year start; the thirteenth, FY2027, had no enacted budget at all as of August 2026. Interim budgets are routine rather than emergency measures. The FY2021 budget was not signed until 11 December 2020, 163 days into the fiscal year.</w:t>
       </w:r>
     </w:p>
     <w:p>
@@ -1520,7 +1520,7 @@
           <w:sz w:val="20"/>
           <w:szCs w:val="20"/>
         </w:rPr>
-        <w:t xml:space="preserve">Budget timing. 651 state-fiscal-years spanning FY2014–FY2027, sourced from NASBO Summaries of Proposed &amp; Enacted Budgets, governors’ press archives, state session-law records and contemporaneous reporting. 575 rows (88%) carry an exact signing date verified against primary sources; 67 (10%) are dated to the month where no source gives the day; 9 record confirmed no-budget years. 577 rows are budget decisions a legislature actually made; the remaining 74 are years covered by a two-year budget passed in an earlier session, and are excluded from every statistic.</w:t>
+        <w:t xml:space="preserve">Budget timing. 651 state-fiscal-years covering FY2015–FY2027, plus a single FY2014 record for New Jersey excluded from every statistic, sourced from NASBO Summaries of Proposed &amp; Enacted Budgets, governors’ press archives, state session-law records and contemporaneous reporting. 575 rows (88%) carry an exact signing date verified against primary sources; 67 (10%) are dated to the month where no source gives the day; 9 record confirmed no-budget years. 577 rows are budget decisions a legislature actually made; the remaining 74 are years covered by a two-year budget passed in an earlier session, and are excluded from every statistic.</w:t>
       </w:r>
     </w:p>
     <w:p>

</xml_diff>